<commit_message>
feat(docx): C6 TOC field + governance appendix C (kb quick-reference)
- real TOC field (F9 to populate) replaces placeholder
- appendix C: governance_chain kb (42 chunks), immunity log (9), Q&A numbers card (8 rows)
- draft v0.9: 504 paras / 22 tables / 1 fig / 49 headings

Co-Authored-By: Claude Code <noreply@anthropic.com>
</commit_message>
<xml_diff>
--- a/docs/初赛设计文档-draft.docx
+++ b/docs/初赛设计文档-draft.docx
@@ -46,6 +46,28 @@
         <w:t>队名：____（待填）　报名编号：____（待填）</w:t>
         <w:br/>
         <w:t>2026 年 11 月</w:t>
+      </w:r>
+    </w:p>
+    <w:p>
+      <w:r>
+        <w:br w:type="page"/>
+      </w:r>
+    </w:p>
+    <w:p>
+      <w:pPr>
+        <w:pStyle w:val="Heading1"/>
+      </w:pPr>
+      <w:r>
+        <w:t>目 录</w:t>
+      </w:r>
+    </w:p>
+    <w:p>
+      <w:r>
+        <w:fldChar w:fldCharType="begin"/>
+        <w:instrText xml:space="preserve"> TOC \o "1-3" \h \z \u </w:instrText>
+        <w:fldChar w:fldCharType="separate"/>
+        <w:t>（在 Word 中右键此处 → 更新域，即可生成目录）</w:t>
+        <w:fldChar w:fldCharType="end"/>
       </w:r>
     </w:p>
     <w:p>
@@ -118,19 +140,6 @@
       </w:r>
     </w:p>
     <w:p>
-      <w:pPr>
-        <w:pStyle w:val="Heading1"/>
-      </w:pPr>
-      <w:r>
-        <w:t>目录</w:t>
-      </w:r>
-    </w:p>
-    <w:p>
-      <w:r>
-        <w:t>（Word 域目录：提交前 F9 刷新；骨架由 build_docx.py 生成）</w:t>
-      </w:r>
-    </w:p>
-    <w:p>
       <w:r>
         <w:br w:type="page"/>
       </w:r>
@@ -12776,6 +12785,308 @@
     <w:p>
       <w:r>
         <w:t xml:space="preserve">  （见《复核命令.md》附录段）。</w:t>
+      </w:r>
+    </w:p>
+    <w:p>
+      <w:r>
+        <w:br w:type="page"/>
+      </w:r>
+    </w:p>
+    <w:p>
+      <w:pPr>
+        <w:pStyle w:val="Heading1"/>
+      </w:pPr>
+      <w:r>
+        <w:t>附录 C：治理知识库与答辩速查</w:t>
+      </w:r>
+    </w:p>
+    <w:p>
+      <w:pPr>
+        <w:pStyle w:val="Heading2"/>
+      </w:pPr>
+      <w:r>
+        <w:t>C.1 治理知识库（governance_chain）</w:t>
+      </w:r>
+    </w:p>
+    <w:p>
+      <w:pPr>
+        <w:pStyle w:val="ListBullet"/>
+      </w:pPr>
+      <w:r>
+        <w:t>知识库 knowledge_name = governance_chain，Elasticsearch 索引 3-4c64eca2085942af8fadf6364d947ce0；治理六件（宪法 / 门控契约 / 命名空间 / 技能注册 / 对账表 / 免疫记录）按 H2 切片共 42 chunks，_bulk 直写 errors=False，词面抽查『宪法 / 门控 / 对账表 / 免疫记录』全部命中。</w:t>
+      </w:r>
+    </w:p>
+    <w:p>
+      <w:pPr>
+        <w:pStyle w:val="ListBullet"/>
+      </w:pPr>
+      <w:r>
+        <w:t>评审/答辩时 Agent 可对治理知识库直接问答：治理规则『遗忘了什么』类反问由对账表 22 条款兜底回应。</w:t>
+      </w:r>
+    </w:p>
+    <w:p>
+      <w:pPr>
+        <w:pStyle w:val="Heading2"/>
+      </w:pPr>
+      <w:r>
+        <w:t>C.2 免疫记录（immunity-log.jsonl）</w:t>
+      </w:r>
+    </w:p>
+    <w:p>
+      <w:r>
+        <w:t>治理链免疫记录累计 9 条（含 graph_retrieval v1.1.0/v1.2.0/v1.3.0 三版升级）——每次路由修正 / 排序修复均先记免疫、再改代码、后复核，形成可追溯的治理闭环。</w:t>
+      </w:r>
+    </w:p>
+    <w:p>
+      <w:pPr>
+        <w:pStyle w:val="Heading2"/>
+      </w:pPr>
+      <w:r>
+        <w:t>C.3 答辩数字速查卡</w:t>
+      </w:r>
+    </w:p>
+    <w:tbl>
+      <w:tblPr>
+        <w:tblStyle w:val="TableGrid"/>
+        <w:tblW w:type="auto" w:w="0"/>
+        <w:tblLook w:firstColumn="1" w:firstRow="1" w:lastColumn="0" w:lastRow="0" w:noHBand="0" w:noVBand="1" w:val="04A0"/>
+      </w:tblPr>
+      <w:tblGrid>
+        <w:gridCol w:w="4320"/>
+        <w:gridCol w:w="4320"/>
+      </w:tblGrid>
+      <w:tr>
+        <w:tc>
+          <w:tcPr>
+            <w:tcW w:type="dxa" w:w="4320"/>
+          </w:tcPr>
+          <w:p>
+            <w:r>
+              <w:rPr>
+                <w:b/>
+              </w:rPr>
+              <w:t>问题</w:t>
+            </w:r>
+          </w:p>
+        </w:tc>
+        <w:tc>
+          <w:tcPr>
+            <w:tcW w:type="dxa" w:w="4320"/>
+          </w:tcPr>
+          <w:p>
+            <w:r>
+              <w:rPr>
+                <w:b/>
+              </w:rPr>
+              <w:t>数字锚点</w:t>
+            </w:r>
+          </w:p>
+        </w:tc>
+      </w:tr>
+      <w:tr>
+        <w:tc>
+          <w:tcPr>
+            <w:tcW w:type="dxa" w:w="4320"/>
+          </w:tcPr>
+          <w:p>
+            <w:r>
+              <w:rPr>
+                <w:b/>
+              </w:rPr>
+              <w:t>图检索准确率？</w:t>
+            </w:r>
+          </w:p>
+        </w:tc>
+        <w:tc>
+          <w:tcPr>
+            <w:tcW w:type="dxa" w:w="4320"/>
+          </w:tcPr>
+          <w:p>
+            <w:r>
+              <w:t>G 层 25 题 v3 = 0.96（24/25，三连跑稳定；v1 0.48 → v2 0.76 → v3 0.96）</w:t>
+            </w:r>
+          </w:p>
+        </w:tc>
+      </w:tr>
+      <w:tr>
+        <w:tc>
+          <w:tcPr>
+            <w:tcW w:type="dxa" w:w="4320"/>
+          </w:tcPr>
+          <w:p>
+            <w:r>
+              <w:rPr>
+                <w:b/>
+              </w:rPr>
+              <w:t>语料规模？</w:t>
+            </w:r>
+          </w:p>
+        </w:tc>
+        <w:tc>
+          <w:tcPr>
+            <w:tcW w:type="dxa" w:w="4320"/>
+          </w:tcPr>
+          <w:p>
+            <w:r>
+              <w:t>757,810 chunks（Apache-2.0，导入中→满库）；rfc-1024 1,739；治理库 42</w:t>
+            </w:r>
+          </w:p>
+        </w:tc>
+      </w:tr>
+      <w:tr>
+        <w:tc>
+          <w:tcPr>
+            <w:tcW w:type="dxa" w:w="4320"/>
+          </w:tcPr>
+          <w:p>
+            <w:r>
+              <w:rPr>
+                <w:b/>
+              </w:rPr>
+              <w:t>检索质量？</w:t>
+            </w:r>
+          </w:p>
+        </w:tc>
+        <w:tc>
+          <w:tcPr>
+            <w:tcW w:type="dxa" w:w="4320"/>
+          </w:tcPr>
+          <w:p>
+            <w:r>
+              <w:t>MRR 0.8494；X 层 25/25 零漂移；BGE 判序 0.9965；延迟 p50 0.33s</w:t>
+            </w:r>
+          </w:p>
+        </w:tc>
+      </w:tr>
+      <w:tr>
+        <w:tc>
+          <w:tcPr>
+            <w:tcW w:type="dxa" w:w="4320"/>
+          </w:tcPr>
+          <w:p>
+            <w:r>
+              <w:rPr>
+                <w:b/>
+              </w:rPr>
+              <w:t>校准阈值？</w:t>
+            </w:r>
+          </w:p>
+        </w:tc>
+        <w:tc>
+          <w:tcPr>
+            <w:tcW w:type="dxa" w:w="4320"/>
+          </w:tcPr>
+          <w:p>
+            <w:r>
+              <w:t>τ=0.8505（域内 92% / 域外 72%）；0.75 档=100%/40%，拍板待定</w:t>
+            </w:r>
+          </w:p>
+        </w:tc>
+      </w:tr>
+      <w:tr>
+        <w:tc>
+          <w:tcPr>
+            <w:tcW w:type="dxa" w:w="4320"/>
+          </w:tcPr>
+          <w:p>
+            <w:r>
+              <w:rPr>
+                <w:b/>
+              </w:rPr>
+              <w:t>护栏拒答？</w:t>
+            </w:r>
+          </w:p>
+        </w:tc>
+        <w:tc>
+          <w:tcPr>
+            <w:tcW w:type="dxa" w:w="4320"/>
+          </w:tcPr>
+          <w:p>
+            <w:r>
+              <w:t>稠密护栏 0.75 拒答阈 + 词面落地核验；域外即拒；R 层门控 FAIL 如实报（p=0.0625，n=25 功效不足，满库后重裁）</w:t>
+            </w:r>
+          </w:p>
+        </w:tc>
+      </w:tr>
+      <w:tr>
+        <w:tc>
+          <w:tcPr>
+            <w:tcW w:type="dxa" w:w="4320"/>
+          </w:tcPr>
+          <w:p>
+            <w:r>
+              <w:rPr>
+                <w:b/>
+              </w:rPr>
+              <w:t>工程测试？</w:t>
+            </w:r>
+          </w:p>
+        </w:tc>
+        <w:tc>
+          <w:tcPr>
+            <w:tcW w:type="dxa" w:w="4320"/>
+          </w:tcPr>
+          <w:p>
+            <w:r>
+              <w:t>make test 118/118；分层评测 R/M/X/C/G 五层逐题 rows；check-consistency 10/10（2,013 边 / 1,865 实体）</w:t>
+            </w:r>
+          </w:p>
+        </w:tc>
+      </w:tr>
+      <w:tr>
+        <w:tc>
+          <w:tcPr>
+            <w:tcW w:type="dxa" w:w="4320"/>
+          </w:tcPr>
+          <w:p>
+            <w:r>
+              <w:rPr>
+                <w:b/>
+              </w:rPr>
+              <w:t>安全性引用？</w:t>
+            </w:r>
+          </w:p>
+        </w:tc>
+        <w:tc>
+          <w:tcPr>
+            <w:tcW w:type="dxa" w:w="4320"/>
+          </w:tcPr>
+          <w:p>
+            <w:r>
+              <w:t>SAGE(2609.36043) 配对 ledger；SkillFlow(2604.17308) 高使用≠高效用；SkillPoison(2610.07645) 95.71% ASR → 只记录不判定</w:t>
+            </w:r>
+          </w:p>
+        </w:tc>
+      </w:tr>
+      <w:tr>
+        <w:tc>
+          <w:tcPr>
+            <w:tcW w:type="dxa" w:w="4320"/>
+          </w:tcPr>
+          <w:p>
+            <w:r>
+              <w:rPr>
+                <w:b/>
+              </w:rPr>
+              <w:t>原创性？</w:t>
+            </w:r>
+          </w:p>
+        </w:tc>
+        <w:tc>
+          <w:tcPr>
+            <w:tcW w:type="dxa" w:w="4320"/>
+          </w:tcPr>
+          <w:p>
+            <w:r>
+              <w:t>三层治理优化方案与元框架 EL 均为本人设计；EL = 方法论上游 + 数据源，参赛主体为基于 Nexent 的政务决策智能体</w:t>
+            </w:r>
+          </w:p>
+        </w:tc>
+      </w:tr>
+    </w:tbl>
+    <w:p>
+      <w:r>
+        <w:br w:type="page"/>
       </w:r>
     </w:p>
     <w:sectPr>

</xml_diff>

<commit_message>
docs(docx): audit-sync -- appendix B ledger 10, appendix C v1.4.0 (G 0.96->1.00), manifest refresh
Co-Authored-By: Claude Code <noreply@anthropic.com>
</commit_message>
<xml_diff>
--- a/docs/初赛设计文档-draft.docx
+++ b/docs/初赛设计文档-draft.docx
@@ -12418,7 +12418,7 @@
         <w:t>拒绝渲染</w:t>
       </w:r>
       <w:r>
-        <w:t>。当前账本 6 笔真实事件</w:t>
+        <w:t>。当前账本 10 笔真实事件（截至 2026-10-29，head IMM-250ee98679）</w:t>
       </w:r>
     </w:p>
     <w:p>
@@ -12834,7 +12834,7 @@
     </w:p>
     <w:p>
       <w:r>
-        <w:t>治理链免疫记录累计 9 条（含 graph_retrieval v1.1.0/v1.2.0/v1.3.0 三版升级）——每次路由修正 / 排序修复均先记免疫、再改代码、后复核，形成可追溯的治理闭环。</w:t>
+        <w:t>治理链免疫记录累计 10 条（head IMM-250ee98679，SHA-256 哈希链防篡改）——含 graph_retrieval v1.1.0/v1.2.0 与 eval-stratified v1.3.0/v1.4.0 升级（G24 负向集合题修复，G 层 0.96→1.00）；每次路由修正 / 排序修复均先记免疫、再改代码、后复核，形成可追溯的治理闭环。</w:t>
       </w:r>
     </w:p>
     <w:p>

</xml_diff>